<commit_message>
Update dashboard with September 2026 data (link: fortinet-backlinking-dashboard-september2026-copy)
Co-Authored-By: Claude Sonnet 5.5 <noreply@anthropic.com>
Claude-Session: https://claude.ai/code/session_01Xa1NF622kdHU6BD2qtHUqv
</commit_message>
<xml_diff>
--- a/monthly-docs/2026-09 Backlink Performance Dashboard data.docx
+++ b/monthly-docs/2026-09 Backlink Performance Dashboard data.docx
@@ -14453,12 +14453,12 @@
           <wp:inline distB="114300" distT="114300" distL="114300" distR="114300">
             <wp:extent cx="5943600" cy="2832100"/>
             <wp:effectExtent b="0" l="0" r="0" t="0"/>
-            <wp:docPr id="10" name="image3.png"/>
+            <wp:docPr id="10" name="image6.png"/>
             <a:graphic>
               <a:graphicData uri="http://schemas.openxmlformats.org/drawingml/2006/picture">
                 <pic:pic>
                   <pic:nvPicPr>
-                    <pic:cNvPr id="0" name="image3.png"/>
+                    <pic:cNvPr id="0" name="image6.png"/>
                     <pic:cNvPicPr preferRelativeResize="0"/>
                   </pic:nvPicPr>
                   <pic:blipFill>
@@ -14729,12 +14729,12 @@
           <wp:inline distB="114300" distT="114300" distL="114300" distR="114300">
             <wp:extent cx="5943600" cy="3175000"/>
             <wp:effectExtent b="0" l="0" r="0" t="0"/>
-            <wp:docPr id="1" name="image1.png"/>
+            <wp:docPr id="1" name="image5.png"/>
             <a:graphic>
               <a:graphicData uri="http://schemas.openxmlformats.org/drawingml/2006/picture">
                 <pic:pic>
                   <pic:nvPicPr>
-                    <pic:cNvPr id="0" name="image1.png"/>
+                    <pic:cNvPr id="0" name="image5.png"/>
                     <pic:cNvPicPr preferRelativeResize="0"/>
                   </pic:nvPicPr>
                   <pic:blipFill>
@@ -14975,12 +14975,12 @@
           <wp:inline distB="114300" distT="114300" distL="114300" distR="114300">
             <wp:extent cx="5943600" cy="3048000"/>
             <wp:effectExtent b="0" l="0" r="0" t="0"/>
-            <wp:docPr id="3" name="image5.png"/>
+            <wp:docPr id="3" name="image13.png"/>
             <a:graphic>
               <a:graphicData uri="http://schemas.openxmlformats.org/drawingml/2006/picture">
                 <pic:pic>
                   <pic:nvPicPr>
-                    <pic:cNvPr id="0" name="image5.png"/>
+                    <pic:cNvPr id="0" name="image13.png"/>
                     <pic:cNvPicPr preferRelativeResize="0"/>
                   </pic:nvPicPr>
                   <pic:blipFill>
@@ -15293,12 +15293,12 @@
           <wp:inline distB="114300" distT="114300" distL="114300" distR="114300">
             <wp:extent cx="5943600" cy="3009900"/>
             <wp:effectExtent b="0" l="0" r="0" t="0"/>
-            <wp:docPr id="5" name="image13.png"/>
+            <wp:docPr id="5" name="image8.png"/>
             <a:graphic>
               <a:graphicData uri="http://schemas.openxmlformats.org/drawingml/2006/picture">
                 <pic:pic>
                   <pic:nvPicPr>
-                    <pic:cNvPr id="0" name="image13.png"/>
+                    <pic:cNvPr id="0" name="image8.png"/>
                     <pic:cNvPicPr preferRelativeResize="0"/>
                   </pic:nvPicPr>
                   <pic:blipFill>
@@ -15572,12 +15572,12 @@
           <wp:inline distB="114300" distT="114300" distL="114300" distR="114300">
             <wp:extent cx="5943600" cy="2844800"/>
             <wp:effectExtent b="0" l="0" r="0" t="0"/>
-            <wp:docPr id="7" name="image6.png"/>
+            <wp:docPr id="7" name="image7.png"/>
             <a:graphic>
               <a:graphicData uri="http://schemas.openxmlformats.org/drawingml/2006/picture">
                 <pic:pic>
                   <pic:nvPicPr>
-                    <pic:cNvPr id="0" name="image6.png"/>
+                    <pic:cNvPr id="0" name="image7.png"/>
                     <pic:cNvPicPr preferRelativeResize="0"/>
                   </pic:nvPicPr>
                   <pic:blipFill>
@@ -16084,12 +16084,12 @@
           <wp:inline distB="114300" distT="114300" distL="114300" distR="114300">
             <wp:extent cx="6134100" cy="4716780"/>
             <wp:effectExtent b="25400" l="25400" r="25400" t="25400"/>
-            <wp:docPr id="9" name="image4.png"/>
+            <wp:docPr id="9" name="image3.png"/>
             <a:graphic>
               <a:graphicData uri="http://schemas.openxmlformats.org/drawingml/2006/picture">
                 <pic:pic>
                   <pic:nvPicPr>
-                    <pic:cNvPr id="0" name="image4.png"/>
+                    <pic:cNvPr id="0" name="image3.png"/>
                     <pic:cNvPicPr preferRelativeResize="0"/>
                   </pic:nvPicPr>
                   <pic:blipFill>
@@ -16631,12 +16631,12 @@
           <wp:inline distB="114300" distT="114300" distL="114300" distR="114300">
             <wp:extent cx="5943600" cy="3810000"/>
             <wp:effectExtent b="25400" l="25400" r="25400" t="25400"/>
-            <wp:docPr id="6" name="image7.png"/>
+            <wp:docPr id="6" name="image4.png"/>
             <a:graphic>
               <a:graphicData uri="http://schemas.openxmlformats.org/drawingml/2006/picture">
                 <pic:pic>
                   <pic:nvPicPr>
-                    <pic:cNvPr id="0" name="image7.png"/>
+                    <pic:cNvPr id="0" name="image4.png"/>
                     <pic:cNvPicPr preferRelativeResize="0"/>
                   </pic:nvPicPr>
                   <pic:blipFill>
@@ -17173,12 +17173,12 @@
           <wp:inline distB="114300" distT="114300" distL="114300" distR="114300">
             <wp:extent cx="5943600" cy="4660900"/>
             <wp:effectExtent b="25400" l="25400" r="25400" t="25400"/>
-            <wp:docPr id="13" name="image2.png"/>
+            <wp:docPr id="13" name="image1.png"/>
             <a:graphic>
               <a:graphicData uri="http://schemas.openxmlformats.org/drawingml/2006/picture">
                 <pic:pic>
                   <pic:nvPicPr>
-                    <pic:cNvPr id="0" name="image2.png"/>
+                    <pic:cNvPr id="0" name="image1.png"/>
                     <pic:cNvPicPr preferRelativeResize="0"/>
                   </pic:nvPicPr>
                   <pic:blipFill>
@@ -17304,12 +17304,12 @@
           <wp:inline distB="114300" distT="114300" distL="114300" distR="114300">
             <wp:extent cx="5486400" cy="8229600"/>
             <wp:effectExtent b="25400" l="25400" r="25400" t="25400"/>
-            <wp:docPr id="11" name="image8.png"/>
+            <wp:docPr id="11" name="image2.png"/>
             <a:graphic>
               <a:graphicData uri="http://schemas.openxmlformats.org/drawingml/2006/picture">
                 <pic:pic>
                   <pic:nvPicPr>
-                    <pic:cNvPr id="0" name="image8.png"/>
+                    <pic:cNvPr id="0" name="image2.png"/>
                     <pic:cNvPicPr preferRelativeResize="0"/>
                   </pic:nvPicPr>
                   <pic:blipFill>

</xml_diff>

<commit_message>
Fortinet dashboard: September 2026 update
Co-Authored-By: Claude Opus 5.5 <noreply@anthropic.com>
Claude-Session: https://claude.ai/code/session_01KK4ng4p5wUbdPPpfixbtcj
</commit_message>
<xml_diff>
--- a/monthly-docs/2026-09 Backlink Performance Dashboard data.docx
+++ b/monthly-docs/2026-09 Backlink Performance Dashboard data.docx
@@ -14453,12 +14453,12 @@
           <wp:inline distB="114300" distT="114300" distL="114300" distR="114300">
             <wp:extent cx="5943600" cy="2832100"/>
             <wp:effectExtent b="0" l="0" r="0" t="0"/>
-            <wp:docPr id="10" name="image6.png"/>
+            <wp:docPr id="10" name="image3.png"/>
             <a:graphic>
               <a:graphicData uri="http://schemas.openxmlformats.org/drawingml/2006/picture">
                 <pic:pic>
                   <pic:nvPicPr>
-                    <pic:cNvPr id="0" name="image6.png"/>
+                    <pic:cNvPr id="0" name="image3.png"/>
                     <pic:cNvPicPr preferRelativeResize="0"/>
                   </pic:nvPicPr>
                   <pic:blipFill>
@@ -14729,12 +14729,12 @@
           <wp:inline distB="114300" distT="114300" distL="114300" distR="114300">
             <wp:extent cx="5943600" cy="3175000"/>
             <wp:effectExtent b="0" l="0" r="0" t="0"/>
-            <wp:docPr id="1" name="image5.png"/>
+            <wp:docPr id="1" name="image1.png"/>
             <a:graphic>
               <a:graphicData uri="http://schemas.openxmlformats.org/drawingml/2006/picture">
                 <pic:pic>
                   <pic:nvPicPr>
-                    <pic:cNvPr id="0" name="image5.png"/>
+                    <pic:cNvPr id="0" name="image1.png"/>
                     <pic:cNvPicPr preferRelativeResize="0"/>
                   </pic:nvPicPr>
                   <pic:blipFill>
@@ -14975,12 +14975,12 @@
           <wp:inline distB="114300" distT="114300" distL="114300" distR="114300">
             <wp:extent cx="5943600" cy="3048000"/>
             <wp:effectExtent b="0" l="0" r="0" t="0"/>
-            <wp:docPr id="3" name="image13.png"/>
+            <wp:docPr id="3" name="image5.png"/>
             <a:graphic>
               <a:graphicData uri="http://schemas.openxmlformats.org/drawingml/2006/picture">
                 <pic:pic>
                   <pic:nvPicPr>
-                    <pic:cNvPr id="0" name="image13.png"/>
+                    <pic:cNvPr id="0" name="image5.png"/>
                     <pic:cNvPicPr preferRelativeResize="0"/>
                   </pic:nvPicPr>
                   <pic:blipFill>
@@ -15293,12 +15293,12 @@
           <wp:inline distB="114300" distT="114300" distL="114300" distR="114300">
             <wp:extent cx="5943600" cy="3009900"/>
             <wp:effectExtent b="0" l="0" r="0" t="0"/>
-            <wp:docPr id="5" name="image8.png"/>
+            <wp:docPr id="5" name="image13.png"/>
             <a:graphic>
               <a:graphicData uri="http://schemas.openxmlformats.org/drawingml/2006/picture">
                 <pic:pic>
                   <pic:nvPicPr>
-                    <pic:cNvPr id="0" name="image8.png"/>
+                    <pic:cNvPr id="0" name="image13.png"/>
                     <pic:cNvPicPr preferRelativeResize="0"/>
                   </pic:nvPicPr>
                   <pic:blipFill>
@@ -15572,12 +15572,12 @@
           <wp:inline distB="114300" distT="114300" distL="114300" distR="114300">
             <wp:extent cx="5943600" cy="2844800"/>
             <wp:effectExtent b="0" l="0" r="0" t="0"/>
-            <wp:docPr id="7" name="image7.png"/>
+            <wp:docPr id="7" name="image6.png"/>
             <a:graphic>
               <a:graphicData uri="http://schemas.openxmlformats.org/drawingml/2006/picture">
                 <pic:pic>
                   <pic:nvPicPr>
-                    <pic:cNvPr id="0" name="image7.png"/>
+                    <pic:cNvPr id="0" name="image6.png"/>
                     <pic:cNvPicPr preferRelativeResize="0"/>
                   </pic:nvPicPr>
                   <pic:blipFill>
@@ -16084,12 +16084,12 @@
           <wp:inline distB="114300" distT="114300" distL="114300" distR="114300">
             <wp:extent cx="6134100" cy="4716780"/>
             <wp:effectExtent b="25400" l="25400" r="25400" t="25400"/>
-            <wp:docPr id="9" name="image3.png"/>
+            <wp:docPr id="9" name="image4.png"/>
             <a:graphic>
               <a:graphicData uri="http://schemas.openxmlformats.org/drawingml/2006/picture">
                 <pic:pic>
                   <pic:nvPicPr>
-                    <pic:cNvPr id="0" name="image3.png"/>
+                    <pic:cNvPr id="0" name="image4.png"/>
                     <pic:cNvPicPr preferRelativeResize="0"/>
                   </pic:nvPicPr>
                   <pic:blipFill>
@@ -16631,12 +16631,12 @@
           <wp:inline distB="114300" distT="114300" distL="114300" distR="114300">
             <wp:extent cx="5943600" cy="3810000"/>
             <wp:effectExtent b="25400" l="25400" r="25400" t="25400"/>
-            <wp:docPr id="6" name="image4.png"/>
+            <wp:docPr id="6" name="image7.png"/>
             <a:graphic>
               <a:graphicData uri="http://schemas.openxmlformats.org/drawingml/2006/picture">
                 <pic:pic>
                   <pic:nvPicPr>
-                    <pic:cNvPr id="0" name="image4.png"/>
+                    <pic:cNvPr id="0" name="image7.png"/>
                     <pic:cNvPicPr preferRelativeResize="0"/>
                   </pic:nvPicPr>
                   <pic:blipFill>
@@ -17173,12 +17173,12 @@
           <wp:inline distB="114300" distT="114300" distL="114300" distR="114300">
             <wp:extent cx="5943600" cy="4660900"/>
             <wp:effectExtent b="25400" l="25400" r="25400" t="25400"/>
-            <wp:docPr id="13" name="image1.png"/>
+            <wp:docPr id="13" name="image2.png"/>
             <a:graphic>
               <a:graphicData uri="http://schemas.openxmlformats.org/drawingml/2006/picture">
                 <pic:pic>
                   <pic:nvPicPr>
-                    <pic:cNvPr id="0" name="image1.png"/>
+                    <pic:cNvPr id="0" name="image2.png"/>
                     <pic:cNvPicPr preferRelativeResize="0"/>
                   </pic:nvPicPr>
                   <pic:blipFill>
@@ -17304,12 +17304,12 @@
           <wp:inline distB="114300" distT="114300" distL="114300" distR="114300">
             <wp:extent cx="5486400" cy="8229600"/>
             <wp:effectExtent b="25400" l="25400" r="25400" t="25400"/>
-            <wp:docPr id="11" name="image2.png"/>
+            <wp:docPr id="11" name="image8.png"/>
             <a:graphic>
               <a:graphicData uri="http://schemas.openxmlformats.org/drawingml/2006/picture">
                 <pic:pic>
                   <pic:nvPicPr>
-                    <pic:cNvPr id="0" name="image2.png"/>
+                    <pic:cNvPr id="0" name="image8.png"/>
                     <pic:cNvPicPr preferRelativeResize="0"/>
                   </pic:nvPicPr>
                   <pic:blipFill>

</xml_diff>